<commit_message>
name the drive pathway as the exception to the no-design-effect finding
The abstract said no design axis we varied moved the margin, and the discussion
listed phase-referenced input inside a sentence claiming indifference to every
axis. Phase-referenced drive is not an instance of indifference: it collapses
the read to 0.24-0.33 against 0.77 for its magnitude twins, at 100% of 288 twin
pairs, and the drive pathway is one of the three axes in the paper's own title.

The finding is unchanged. Geometry, tonotopy, coupling law and gain all leave
the margin alone, which is what the no-effect result rests on; the drive
pathway is stated as the exception rather than folded in with them. The paper's
README carried the same sentence and has the same fix.
</commit_message>
<xml_diff>
--- a/papers/02-untrained-reservoirs/spoken-digit-recognition-without-training-DRAFT.docx
+++ b/papers/02-untrained-reservoirs/spoken-digit-recognition-without-training-DRAFT.docx
@@ -21,7 +21,7 @@
         <w:rPr>
           <w:lang w:val="en-GB"/>
         </w:rPr>
-        <w:t xml:space="preserve">2026-08-22</w:t>
+        <w:t xml:space="preserve">2026-09-01</w:t>
       </w:r>
     </w:p>
     <w:p>
@@ -172,43 +172,55 @@
         <w:rPr>
           <w:lang w:val="en-GB"/>
         </w:rPr>
-        <w:t xml:space="preserve">no design axis we varied moved that margin. On an order-discrimination task built so that order-</w:t>
-      </w:r>
-      <w:r>
-        <w:rPr>
-          <w:lang w:val="en-GB"/>
-        </w:rPr>
-        <w:t xml:space="preserve"> </w:t>
-      </w:r>
-      <w:r>
-        <w:rPr>
-          <w:lang w:val="en-GB"/>
-        </w:rPr>
-        <w:t xml:space="preserve">free readouts provably cannot answer it, the same frozen fields read temporal order at 0.97 to</w:t>
-      </w:r>
-      <w:r>
-        <w:rPr>
-          <w:lang w:val="en-GB"/>
-        </w:rPr>
-        <w:t xml:space="preserve"> </w:t>
-      </w:r>
-      <w:r>
-        <w:rPr>
-          <w:lang w:val="en-GB"/>
-        </w:rPr>
-        <w:t xml:space="preserve">1.00, and a severed-coupling control attributes that memory predominantly to per-oscillator</w:t>
-      </w:r>
-      <w:r>
-        <w:rPr>
-          <w:lang w:val="en-GB"/>
-        </w:rPr>
-        <w:t xml:space="preserve"> </w:t>
-      </w:r>
-      <w:r>
-        <w:rPr>
-          <w:lang w:val="en-GB"/>
-        </w:rPr>
-        <w:t xml:space="preserve">phase integration.</w:t>
+        <w:t xml:space="preserve">no design axis we varied moved that margin, with one exception: phase-referenced drive is not</w:t>
+      </w:r>
+      <w:r>
+        <w:rPr>
+          <w:lang w:val="en-GB"/>
+        </w:rPr>
+        <w:t xml:space="preserve"> </w:t>
+      </w:r>
+      <w:r>
+        <w:rPr>
+          <w:lang w:val="en-GB"/>
+        </w:rPr>
+        <w:t xml:space="preserve">merely worse untrained but unreadable. On an order-discrimination task built so that order-free</w:t>
+      </w:r>
+      <w:r>
+        <w:rPr>
+          <w:lang w:val="en-GB"/>
+        </w:rPr>
+        <w:t xml:space="preserve"> </w:t>
+      </w:r>
+      <w:r>
+        <w:rPr>
+          <w:lang w:val="en-GB"/>
+        </w:rPr>
+        <w:t xml:space="preserve">readouts provably cannot answer it, the same frozen fields read temporal order at 0.97 to 1.00,</w:t>
+      </w:r>
+      <w:r>
+        <w:rPr>
+          <w:lang w:val="en-GB"/>
+        </w:rPr>
+        <w:t xml:space="preserve"> </w:t>
+      </w:r>
+      <w:r>
+        <w:rPr>
+          <w:lang w:val="en-GB"/>
+        </w:rPr>
+        <w:t xml:space="preserve">and a severed-coupling control attributes that memory predominantly to per-oscillator phase</w:t>
+      </w:r>
+      <w:r>
+        <w:rPr>
+          <w:lang w:val="en-GB"/>
+        </w:rPr>
+        <w:t xml:space="preserve"> </w:t>
+      </w:r>
+      <w:r>
+        <w:rPr>
+          <w:lang w:val="en-GB"/>
+        </w:rPr>
+        <w:t xml:space="preserve">integration.</w:t>
       </w:r>
     </w:p>
     <w:bookmarkStart w:id="9" w:name="introduction"/>
@@ -8265,31 +8277,31 @@
         <w:rPr>
           <w:lang w:val="en-GB"/>
         </w:rPr>
-        <w:t xml:space="preserve">margin was indifferent to every design axis we varied: geometry and tonotopic design each showed little impact beyond their controls (the latter even with measured locking),</w:t>
-      </w:r>
-      <w:r>
-        <w:rPr>
-          <w:lang w:val="en-GB"/>
-        </w:rPr>
-        <w:t xml:space="preserve"> </w:t>
-      </w:r>
-      <w:r>
-        <w:rPr>
-          <w:lang w:val="en-GB"/>
-        </w:rPr>
-        <w:t xml:space="preserve">the coupling law was worth under a point, gain was nearly inert, and phase-referenced</w:t>
-      </w:r>
-      <w:r>
-        <w:rPr>
-          <w:lang w:val="en-GB"/>
-        </w:rPr>
-        <w:t xml:space="preserve"> </w:t>
-      </w:r>
-      <w:r>
-        <w:rPr>
-          <w:lang w:val="en-GB"/>
-        </w:rPr>
-        <w:t xml:space="preserve">input was unreadable. On the order task, the one task whose answer requires memory, the premise holds emphatically: near-ceiling accuracy over chance-blind floors, carried</w:t>
+        <w:t xml:space="preserve">margin was indifferent to every design axis we varied but one: geometry and tonotopic design each showed little impact beyond their controls (the latter even with measured locking),</w:t>
+      </w:r>
+      <w:r>
+        <w:rPr>
+          <w:lang w:val="en-GB"/>
+        </w:rPr>
+        <w:t xml:space="preserve"> </w:t>
+      </w:r>
+      <w:r>
+        <w:rPr>
+          <w:lang w:val="en-GB"/>
+        </w:rPr>
+        <w:t xml:space="preserve">the coupling law was worth under a point, and gain was nearly inert; the exception is</w:t>
+      </w:r>
+      <w:r>
+        <w:rPr>
+          <w:lang w:val="en-GB"/>
+        </w:rPr>
+        <w:t xml:space="preserve"> </w:t>
+      </w:r>
+      <w:r>
+        <w:rPr>
+          <w:lang w:val="en-GB"/>
+        </w:rPr>
+        <w:t xml:space="preserve">the drive pathway, where phase-referenced input was unreadable rather than merely worse. On the order task, the one task whose answer requires memory, the premise holds emphatically: near-ceiling accuracy over chance-blind floors, carried</w:t>
       </w:r>
       <w:r>
         <w:rPr>

</xml_diff>

<commit_message>
complete the hairer entry, and record the leaf preprint
A registry cross-check of all 32 cited entries against CrossRef and arXiv: 27
verified clean, 4 have no registry record by nature (Jaeger's tech report, the
PMLR paper, the Un-0 blog, the OpenReview paper), and one was wrong.

Hairer et al. (1993) was entered as author {Hairer}, a surname with no given
name for a three-author book, and carried the series name in the publisher
field. CrossRef has no author list for that record, so OpenAlex confirms the
three: Ernst Hairer, Syvert P. Norsett, Gerhard Wanner. The DOI was right.

The LEAF entry cites the ICLR version, which mints no DOI, so nothing could
verify it. Its arXiv id is recorded the way paper 01 records preprints, which
also takes the citemap to zero keys without an identifier.

Also unwrapped one citation that read "reviewed by (Dogonasheva et al., 2026)".
That wants the narrative form, and now that citations are links rather than
brackets it can have it.
</commit_message>
<xml_diff>
--- a/papers/02-untrained-reservoirs/spoken-digit-recognition-without-training-DRAFT.docx
+++ b/papers/02-untrained-reservoirs/spoken-digit-recognition-without-training-DRAFT.docx
@@ -3762,7 +3762,7 @@
             <w:rStyle w:val="Hyperlink"/>
             <w:lang w:val="en-GB"/>
           </w:rPr>
-          <w:t xml:space="preserve">Hairer, 1993</w:t>
+          <w:t xml:space="preserve">Hairer et al., 1993</w:t>
         </w:r>
       </w:hyperlink>
       <w:r>
@@ -9460,7 +9460,7 @@
         <w:rPr>
           <w:lang w:val="en-GB"/>
         </w:rPr>
-        <w:t xml:space="preserve">(</w:t>
+        <w:t xml:space="preserve">Dogonasheva et al. (</w:t>
       </w:r>
       <w:hyperlink w:anchor="ref-dogonasheva2026">
         <w:r>
@@ -9468,7 +9468,7 @@
             <w:rStyle w:val="Hyperlink"/>
             <w:lang w:val="en-GB"/>
           </w:rPr>
-          <w:t xml:space="preserve">Dogonasheva et al., 2026</w:t>
+          <w:t xml:space="preserve">2026</w:t>
         </w:r>
       </w:hyperlink>
       <w:r>
@@ -10630,7 +10630,7 @@
         <w:rPr>
           <w:lang w:val="en-GB"/>
         </w:rPr>
-        <w:t xml:space="preserve">Hairer. (1993).</w:t>
+        <w:t xml:space="preserve">Hairer, E., Nørsett, S. P., &amp; Wanner, G. (1993).</w:t>
       </w:r>
       <w:r>
         <w:rPr>
@@ -10650,7 +10650,13 @@
         <w:rPr>
           <w:lang w:val="en-GB"/>
         </w:rPr>
-        <w:t xml:space="preserve">. Springer Series in Computational Mathematics.</w:t>
+        <w:t xml:space="preserve"> </w:t>
+      </w:r>
+      <w:r>
+        <w:rPr>
+          <w:lang w:val="en-GB"/>
+        </w:rPr>
+        <w:t xml:space="preserve">(2nd revised, Vol. 8). Springer.</w:t>
       </w:r>
       <w:r>
         <w:rPr>

</xml_diff>